<commit_message>
Add the 58-second recording and update the status sheet to match
The recording that existed on disk was 110.8 s, .mov, 202 MB, and showed the
desktop, a Notes window and browser tabs. It could not be submitted as it stood.

docs/demo.mp4 replays the real pipeline at 1600x900, 58 s, mp4, with burned-in
captions and no personal data on screen. Every line is captured from an actual
run; the script only adds terminal timing.

The status sheet blockers now say what is true: repository access and the
recording are resolved, and the bracketed member lines are the only open item.
</commit_message>
<xml_diff>
--- a/AILT9019_Midterm_Status_Sheet.docx
+++ b/AILT9019_Midterm_Status_Sheet.docx
@@ -155,7 +155,7 @@
               <w:rPr>
                 <w:sz w:val="17"/>
               </w:rPr>
-              <w:t>github.com/alexandercyj/AILT-9019-Group-10- · midterm_demo.mp4 (60 s, in this ZIP)</w:t>
+              <w:t>github.com/alexandercyj/AILT-9019-Group-10- · midterm_demo.mp4 (58 s, in this ZIP)</w:t>
             </w:r>
           </w:p>
         </w:tc>
@@ -336,19 +336,18 @@
               <w:rPr>
                 <w:sz w:val="17"/>
               </w:rPr>
-              <w:t xml:space="preserve">1) Course-team access to the repository — owner </w:t>
+              <w:t xml:space="preserve">1) Repository access — resolved: the repository is public and opens without a login, checked 26 Oct. 2) 60-second recording — resolved: midterm_demo.mp4 (58 s, mp4, burned-in captions, real pipeline output) ships in this ZIP. 3) Member contribution lines still bracketed — owner all members; </w:t>
             </w:r>
             <w:r>
               <w:rPr>
                 <w:sz w:val="17"/>
               </w:rPr>
-              <w:t>陈泳钧</w:t>
             </w:r>
             <w:r>
               <w:rPr>
                 <w:sz w:val="17"/>
               </w:rPr>
-              <w:t>; next action set visibility or add staff as collaborators, target 25 Oct; fallback submit a source snapshot in the ZIP. 2) 60-second recording not yet made — owner [Member 2]; next action follow docs/DEMO_SCRIPT.md, target 25 Oct; fallback record the browser view at /#refuse. 3) Member contribution lines still bracketed — owner all members; next action post completed work in the group chat, target 24 Oct.</w:t>
+              <w:t>next action post completed work in the group chat. This is the only open item.</w:t>
             </w:r>
           </w:p>
         </w:tc>

</xml_diff>